<commit_message>
docs: make 1.0.11 upgrade customer-runnable
</commit_message>
<xml_diff>
--- a/docs/Upgrading MikeOssAzure to 1.0.11.docx
+++ b/docs/Upgrading MikeOssAzure to 1.0.11.docx
@@ -74,7 +74,7 @@
                 <w:color w:val="344054"/>
                 <w:sz w:val="21"/>
               </w:rPr>
-              <w:t>Azure Marketplace does not automatically update an existing Mike deployment. Run the supplied upgrade script once. Do not edit the db-migrate job or backend Container App manually, and do not redeploy the complete Marketplace template.</w:t>
+              <w:t>Azure Marketplace does not automatically update an existing Mike deployment. Run the supplied upgrade script once. Do not edit the db-migrate job or backend Container App manually, and do not redeploy the complete Marketplace template. The Marketplace ZIP is for Partner Center publication and new deployments; it does not upgrade an existing customer installation.</w:t>
             </w:r>
           </w:p>
         </w:tc>
@@ -462,7 +462,7 @@
                 <w:color w:val="344054"/>
                 <w:sz w:val="20"/>
               </w:rPr>
-              <w:t>Contributor, or equivalent, on the Mike resource group</w:t>
+              <w:t>Contributor, or equivalent, on the Mike resource group; plus Key Vault Secrets Officer, or equivalent secret-write access, on the Mike Key Vault for the recovery-administrator step</w:t>
             </w:r>
           </w:p>
         </w:tc>
@@ -536,7 +536,7 @@
                 <w:color w:val="344054"/>
                 <w:sz w:val="20"/>
               </w:rPr>
-              <w:t>Azure CLI 2.60 or later with Container Apps commands, and PowerShell 7</w:t>
+              <w:t>Azure Portal Cloud Shell in PowerShell mode (PowerShell 7 with Azure CLI and Container Apps commands) and access to the supplied versioned release-script URL</w:t>
             </w:r>
           </w:p>
         </w:tc>
@@ -1420,14 +1420,6 @@
     </w:p>
     <w:p>
       <w:pPr>
-        <w:spacing w:after="0"/>
-      </w:pPr>
-      <w:r>
-        <w:br w:type="page"/>
-      </w:r>
-    </w:p>
-    <w:p>
-      <w:pPr>
         <w:pStyle w:val="Heading1"/>
       </w:pPr>
       <w:r>
@@ -1436,7 +1428,7 @@
     </w:p>
     <w:p>
       <w:r>
-        <w:t>Complete these checks before changing the installation. Record the resource group and starting image; the procedure supports 1.0.9 and 1.0.10 only.</w:t>
+        <w:t>Complete these checks before changing the installation. Record the resource group and starting image; the procedure supports 1.0.9 and 1.0.10 only. No Mike source-repository, Docker, MikeMigrate, or CI/CD access is required.</w:t>
       </w:r>
     </w:p>
     <w:p>
@@ -1444,13 +1436,91 @@
         <w:pStyle w:val="Heading2"/>
       </w:pPr>
       <w:r>
-        <w:t>Step 1 - Download the release asset</w:t>
+        <w:t>Step 1 - Open Azure Cloud Shell and download the release asset</w:t>
       </w:r>
     </w:p>
     <w:p>
       <w:r>
-        <w:t>Download upgrade-marketplace-1.0.11.ps1 from the 1.0.11 release supplied by Mike support. Save it to a known local folder.</w:t>
+        <w:t>In the Azure Portal, open Cloud Shell and select PowerShell. Mike support supplies a versioned Azure Storage URL for upgrade-marketplace-1.0.11.ps1. Download that single release asset into Cloud Shell. Do not use mike-marketplace-1.0.11.zip for this procedure.</w:t>
       </w:r>
+    </w:p>
+    <w:tbl>
+      <w:tblPr>
+        <w:tblW w:type="dxa" w:w="9026"/>
+        <w:jc w:val="left"/>
+        <w:tblLayout w:type="fixed"/>
+        <w:tblLook w:firstColumn="1" w:firstRow="1" w:lastColumn="0" w:lastRow="0" w:noHBand="0" w:noVBand="1" w:val="04A0"/>
+        <w:tblInd w:w="120" w:type="dxa"/>
+      </w:tblPr>
+      <w:tblGrid>
+        <w:gridCol w:w="9026"/>
+      </w:tblGrid>
+      <w:tr>
+        <w:trPr>
+          <w:cantSplit/>
+        </w:trPr>
+        <w:tc>
+          <w:tcPr>
+            <w:tcW w:type="dxa" w:w="9026"/>
+            <w:tcMar>
+              <w:top w:w="80" w:type="dxa"/>
+              <w:start w:w="120" w:type="dxa"/>
+              <w:bottom w:w="80" w:type="dxa"/>
+              <w:end w:w="120" w:type="dxa"/>
+            </w:tcMar>
+            <w:vAlign w:val="center"/>
+            <w:shd w:fill="F2F4F7"/>
+            <w:tcBorders>
+              <w:top w:val="single" w:sz="6" w:space="0" w:color="D0D5DD"/>
+              <w:start w:val="single" w:sz="6" w:space="0" w:color="D0D5DD"/>
+              <w:bottom w:val="single" w:sz="6" w:space="0" w:color="D0D5DD"/>
+              <w:end w:val="single" w:sz="6" w:space="0" w:color="D0D5DD"/>
+              <w:insideH w:val="single" w:sz="6" w:space="0" w:color="D0D5DD"/>
+              <w:insideV w:val="single" w:sz="6" w:space="0" w:color="D0D5DD"/>
+            </w:tcBorders>
+          </w:tcPr>
+          <w:p>
+            <w:pPr>
+              <w:spacing w:before="60" w:after="60" w:line="240" w:lineRule="auto"/>
+            </w:pPr>
+            <w:r>
+              <w:rPr>
+                <w:rFonts w:ascii="Consolas" w:hAnsi="Consolas"/>
+                <w:color w:val="101828"/>
+                <w:sz w:val="18"/>
+              </w:rPr>
+              <w:t>$UpgradeUri = "&lt;MIKE-SUPPLIED-AZURE-STORAGE-URL&gt;"</w:t>
+            </w:r>
+            <w:r>
+              <w:br/>
+            </w:r>
+            <w:r>
+              <w:rPr>
+                <w:rFonts w:ascii="Consolas" w:hAnsi="Consolas"/>
+                <w:color w:val="101828"/>
+                <w:sz w:val="18"/>
+              </w:rPr>
+              <w:t>Invoke-WebRequest -Uri $UpgradeUri `</w:t>
+            </w:r>
+            <w:r>
+              <w:br/>
+            </w:r>
+            <w:r>
+              <w:rPr>
+                <w:rFonts w:ascii="Consolas" w:hAnsi="Consolas"/>
+                <w:color w:val="101828"/>
+                <w:sz w:val="18"/>
+              </w:rPr>
+              <w:t xml:space="preserve">  -OutFile "./upgrade-marketplace-1.0.11.ps1"</w:t>
+            </w:r>
+          </w:p>
+        </w:tc>
+      </w:tr>
+    </w:tbl>
+    <w:p>
+      <w:pPr>
+        <w:spacing w:after="0"/>
+      </w:pPr>
     </w:p>
     <w:tbl>
       <w:tblPr>
@@ -1510,7 +1580,7 @@
                 <w:color w:val="0B2545"/>
                 <w:sz w:val="20"/>
               </w:rPr>
-              <w:t>Capture: the downloaded upgrade-marketplace-1.0.11.ps1 file in File Explorer</w:t>
+              <w:t>Capture: Azure Cloud Shell in PowerShell mode showing the successful download of upgrade-marketplace-1.0.11.ps1</w:t>
             </w:r>
             <w:r>
               <w:br/>
@@ -1522,7 +1592,7 @@
                 <w:color w:val="667085"/>
                 <w:sz w:val="17"/>
               </w:rPr>
-              <w:t>Redact: user profile paths if they identify an individual.</w:t>
+              <w:t>Redact: the supplied release URL if it contains a SAS token, plus subscription and tenant identifiers.</w:t>
             </w:r>
             <w:r>
               <w:br/>
@@ -1549,12 +1619,12 @@
         <w:pStyle w:val="Heading2"/>
       </w:pPr>
       <w:r>
-        <w:t>Step 2 - Open PowerShell 7</w:t>
+        <w:t>Step 2 - Confirm PowerShell 7</w:t>
       </w:r>
     </w:p>
     <w:p>
       <w:r>
-        <w:t>Open PowerShell 7 in the folder containing the script. Windows PowerShell 5 is not supported by this upgrade command.</w:t>
+        <w:t>Azure Cloud Shell must be in PowerShell mode. Run $PSVersionTable.PSVersion and confirm the major version is 7 before continuing.</w:t>
       </w:r>
     </w:p>
     <w:p>
@@ -1604,17 +1674,6 @@
             <w:pPr>
               <w:spacing w:before="60" w:after="60" w:line="240" w:lineRule="auto"/>
             </w:pPr>
-            <w:r>
-              <w:rPr>
-                <w:rFonts w:ascii="Consolas" w:hAnsi="Consolas"/>
-                <w:color w:val="101828"/>
-                <w:sz w:val="18"/>
-              </w:rPr>
-              <w:t>az login</w:t>
-            </w:r>
-            <w:r>
-              <w:br/>
-            </w:r>
             <w:r>
               <w:rPr>
                 <w:rFonts w:ascii="Consolas" w:hAnsi="Consolas"/>
@@ -2030,7 +2089,26 @@
         <w:pStyle w:val="Heading2"/>
       </w:pPr>
       <w:r>
-        <w:t>Step 5 - Unblock the downloaded script</w:t>
+        <w:t>Step 5 - Verify the release script</w:t>
+      </w:r>
+    </w:p>
+    <w:p>
+      <w:r>
+        <w:rPr>
+          <w:rFonts w:ascii="Calibri" w:hAnsi="Calibri"/>
+          <w:b/>
+          <w:color w:val="0B2545"/>
+          <w:sz w:val="22"/>
+        </w:rPr>
+        <w:t xml:space="preserve">Expected SHA-256: </w:t>
+      </w:r>
+      <w:r>
+        <w:rPr>
+          <w:rFonts w:ascii="Calibri" w:hAnsi="Calibri"/>
+          <w:color w:val="344054"/>
+          <w:sz w:val="22"/>
+        </w:rPr>
+        <w:t>C1AB2792DF0386EC30F0C96902F9C6CC3B6FECBF9487FF44BAAD0438AD18FAB5</w:t>
       </w:r>
     </w:p>
     <w:tbl>
@@ -2078,7 +2156,7 @@
                 <w:color w:val="101828"/>
                 <w:sz w:val="18"/>
               </w:rPr>
-              <w:t>Unblock-File ".\upgrade-marketplace-1.0.11.ps1"</w:t>
+              <w:t>Get-FileHash "./upgrade-marketplace-1.0.11.ps1" -Algorithm SHA256</w:t>
             </w:r>
           </w:p>
         </w:tc>
@@ -3130,7 +3208,16 @@
             <w:vAlign w:val="center"/>
           </w:tcPr>
           <w:p>
+            <w:pPr>
+              <w:spacing w:after="0"/>
+            </w:pPr>
             <w:r>
+              <w:rPr>
+                <w:rFonts w:ascii="Calibri" w:hAnsi="Calibri"/>
+                <w:b/>
+                <w:color w:val="344054"/>
+                <w:sz w:val="19"/>
+              </w:rPr>
               <w:t>External services</w:t>
             </w:r>
           </w:p>
@@ -3156,8 +3243,164 @@
             <w:vAlign w:val="center"/>
           </w:tcPr>
           <w:p>
+            <w:pPr>
+              <w:spacing w:after="0"/>
+            </w:pPr>
             <w:r>
+              <w:rPr>
+                <w:rFonts w:ascii="Calibri" w:hAnsi="Calibri"/>
+                <w:color w:val="344054"/>
+                <w:sz w:val="19"/>
+              </w:rPr>
               <w:t>Settings &gt; API Keys is read-only; each required provider is configured or clearly requires administrator action through /install.</w:t>
+            </w:r>
+          </w:p>
+        </w:tc>
+      </w:tr>
+      <w:tr>
+        <w:trPr>
+          <w:cantSplit/>
+        </w:trPr>
+        <w:tc>
+          <w:tcPr>
+            <w:tcW w:type="dxa" w:w="2300"/>
+            <w:shd w:fill="FFFFFF"/>
+            <w:tcBorders>
+              <w:top w:val="single" w:sz="5" w:space="0" w:color="D0D5DD"/>
+              <w:start w:val="single" w:sz="5" w:space="0" w:color="D0D5DD"/>
+              <w:bottom w:val="single" w:sz="5" w:space="0" w:color="D0D5DD"/>
+              <w:end w:val="single" w:sz="5" w:space="0" w:color="D0D5DD"/>
+              <w:insideH w:val="single" w:sz="5" w:space="0" w:color="D0D5DD"/>
+              <w:insideV w:val="single" w:sz="5" w:space="0" w:color="D0D5DD"/>
+            </w:tcBorders>
+            <w:tcMar>
+              <w:top w:w="80" w:type="dxa"/>
+              <w:start w:w="120" w:type="dxa"/>
+              <w:bottom w:w="80" w:type="dxa"/>
+              <w:end w:w="120" w:type="dxa"/>
+            </w:tcMar>
+            <w:vAlign w:val="center"/>
+          </w:tcPr>
+          <w:p>
+            <w:pPr>
+              <w:spacing w:after="0"/>
+            </w:pPr>
+            <w:r>
+              <w:rPr>
+                <w:rFonts w:ascii="Calibri" w:hAnsi="Calibri"/>
+                <w:b/>
+                <w:color w:val="344054"/>
+                <w:sz w:val="19"/>
+              </w:rPr>
+              <w:t>Connectors</w:t>
+            </w:r>
+          </w:p>
+        </w:tc>
+        <w:tc>
+          <w:tcPr>
+            <w:tcW w:type="dxa" w:w="6726"/>
+            <w:shd w:fill="FFFFFF"/>
+            <w:tcBorders>
+              <w:top w:val="single" w:sz="5" w:space="0" w:color="D0D5DD"/>
+              <w:start w:val="single" w:sz="5" w:space="0" w:color="D0D5DD"/>
+              <w:bottom w:val="single" w:sz="5" w:space="0" w:color="D0D5DD"/>
+              <w:end w:val="single" w:sz="5" w:space="0" w:color="D0D5DD"/>
+              <w:insideH w:val="single" w:sz="5" w:space="0" w:color="D0D5DD"/>
+              <w:insideV w:val="single" w:sz="5" w:space="0" w:color="D0D5DD"/>
+            </w:tcBorders>
+            <w:tcMar>
+              <w:top w:w="80" w:type="dxa"/>
+              <w:start w:w="120" w:type="dxa"/>
+              <w:bottom w:w="80" w:type="dxa"/>
+              <w:end w:w="120" w:type="dxa"/>
+            </w:tcMar>
+            <w:vAlign w:val="center"/>
+          </w:tcPr>
+          <w:p>
+            <w:pPr>
+              <w:spacing w:after="0"/>
+            </w:pPr>
+            <w:r>
+              <w:rPr>
+                <w:rFonts w:ascii="Calibri" w:hAnsi="Calibri"/>
+                <w:color w:val="344054"/>
+                <w:sz w:val="19"/>
+              </w:rPr>
+              <w:t>Settings &gt; Connectors opens without an error and an MCP connector can be configured.</w:t>
+            </w:r>
+          </w:p>
+        </w:tc>
+      </w:tr>
+      <w:tr>
+        <w:trPr>
+          <w:cantSplit/>
+        </w:trPr>
+        <w:tc>
+          <w:tcPr>
+            <w:tcW w:type="dxa" w:w="2300"/>
+            <w:shd w:fill="FFFFFF"/>
+            <w:tcBorders>
+              <w:top w:val="single" w:sz="5" w:space="0" w:color="D0D5DD"/>
+              <w:start w:val="single" w:sz="5" w:space="0" w:color="D0D5DD"/>
+              <w:bottom w:val="single" w:sz="5" w:space="0" w:color="D0D5DD"/>
+              <w:end w:val="single" w:sz="5" w:space="0" w:color="D0D5DD"/>
+              <w:insideH w:val="single" w:sz="5" w:space="0" w:color="D0D5DD"/>
+              <w:insideV w:val="single" w:sz="5" w:space="0" w:color="D0D5DD"/>
+            </w:tcBorders>
+            <w:tcMar>
+              <w:top w:w="80" w:type="dxa"/>
+              <w:start w:w="120" w:type="dxa"/>
+              <w:bottom w:w="80" w:type="dxa"/>
+              <w:end w:w="120" w:type="dxa"/>
+            </w:tcMar>
+            <w:vAlign w:val="center"/>
+          </w:tcPr>
+          <w:p>
+            <w:pPr>
+              <w:spacing w:after="0"/>
+            </w:pPr>
+            <w:r>
+              <w:rPr>
+                <w:rFonts w:ascii="Calibri" w:hAnsi="Calibri"/>
+                <w:b/>
+                <w:color w:val="344054"/>
+                <w:sz w:val="19"/>
+              </w:rPr>
+              <w:t>/install access</w:t>
+            </w:r>
+          </w:p>
+        </w:tc>
+        <w:tc>
+          <w:tcPr>
+            <w:tcW w:type="dxa" w:w="6726"/>
+            <w:shd w:fill="FFFFFF"/>
+            <w:tcBorders>
+              <w:top w:val="single" w:sz="5" w:space="0" w:color="D0D5DD"/>
+              <w:start w:val="single" w:sz="5" w:space="0" w:color="D0D5DD"/>
+              <w:bottom w:val="single" w:sz="5" w:space="0" w:color="D0D5DD"/>
+              <w:end w:val="single" w:sz="5" w:space="0" w:color="D0D5DD"/>
+              <w:insideH w:val="single" w:sz="5" w:space="0" w:color="D0D5DD"/>
+              <w:insideV w:val="single" w:sz="5" w:space="0" w:color="D0D5DD"/>
+            </w:tcBorders>
+            <w:tcMar>
+              <w:top w:w="80" w:type="dxa"/>
+              <w:start w:w="120" w:type="dxa"/>
+              <w:bottom w:w="80" w:type="dxa"/>
+              <w:end w:w="120" w:type="dxa"/>
+            </w:tcMar>
+            <w:vAlign w:val="center"/>
+          </w:tcPr>
+          <w:p>
+            <w:pPr>
+              <w:spacing w:after="0"/>
+            </w:pPr>
+            <w:r>
+              <w:rPr>
+                <w:rFonts w:ascii="Calibri" w:hAnsi="Calibri"/>
+                <w:color w:val="344054"/>
+                <w:sz w:val="19"/>
+              </w:rPr>
+              <w:t>The intended administrator can sign in; their immutable Entra object ID is recorded for recovery.</w:t>
             </w:r>
           </w:p>
         </w:tc>
@@ -3862,15 +4105,18 @@
       </w:r>
     </w:p>
     <w:p>
-      <w:pPr/>
       <w:r>
         <w:t>Open Settings &gt; API Keys. This page is read-only: provider credentials are shared by the organisation and stored in Azure Key Vault. Confirm that every provider the customer uses shows Configured for this organisation. If a provider shows Administrator action required, an administrator must open /install and configure it; ordinary users must not paste personal provider keys.</w:t>
       </w:r>
     </w:p>
     <w:p>
-      <w:pPr/>
       <w:r>
         <w:t>CourtListener uses the Key Vault secret courtlistener-api-token. The upgrade preserves existing Key Vault secrets, so no manual action is required when the token already exists. If it is missing, the administrator adds it through /install before users enable US legal research.</w:t>
+      </w:r>
+    </w:p>
+    <w:p>
+      <w:r>
+        <w:t>Kimi K3 is optional. To enable it for the organisation, an administrator stores the Moonshot AI credential through /install; Mike writes it to the Key Vault secret moonshot-api-key. Users do not enter personal Kimi keys.</w:t>
       </w:r>
     </w:p>
     <w:tbl>
@@ -3931,7 +4177,7 @@
                 <w:color w:val="0B2545"/>
                 <w:sz w:val="20"/>
               </w:rPr>
-              <w:t>Capture: Settings &gt; API Keys showing organisation-wide provider status and the CourtListener Key Vault name courtlistener-api-token</w:t>
+              <w:t>Capture: Settings &gt; API Keys showing organisation-wide provider status, including CourtListener and Kimi K3 when used</w:t>
             </w:r>
             <w:r>
               <w:br/>
@@ -3960,6 +4206,476 @@
         </w:tc>
       </w:tr>
     </w:tbl>
+    <w:p>
+      <w:pPr>
+        <w:spacing w:after="0"/>
+      </w:pPr>
+    </w:p>
+    <w:p>
+      <w:pPr>
+        <w:pStyle w:val="Heading2"/>
+      </w:pPr>
+      <w:r>
+        <w:t>Step 13 - Confirm the Connectors page</w:t>
+      </w:r>
+    </w:p>
+    <w:p>
+      <w:r>
+        <w:t>Open Settings &gt; Connectors. Version 1.0.11 fixes the full-page crash seen in earlier same-origin Marketplace builds when the public API base URL was empty. The bundled Marketplace deployment needs no customer-specific NEXT_PUBLIC_API_BASE_URL setting.</w:t>
+      </w:r>
+    </w:p>
+    <w:tbl>
+      <w:tblPr>
+        <w:tblW w:type="dxa" w:w="9026"/>
+        <w:jc w:val="left"/>
+        <w:tblLayout w:type="fixed"/>
+        <w:tblLook w:firstColumn="1" w:firstRow="1" w:lastColumn="0" w:lastRow="0" w:noHBand="0" w:noVBand="1" w:val="04A0"/>
+        <w:tblInd w:w="120" w:type="dxa"/>
+      </w:tblPr>
+      <w:tblGrid>
+        <w:gridCol w:w="9026"/>
+      </w:tblGrid>
+      <w:tr>
+        <w:trPr>
+          <w:cantSplit/>
+        </w:trPr>
+        <w:tc>
+          <w:tcPr>
+            <w:tcW w:type="dxa" w:w="9026"/>
+            <w:tcMar>
+              <w:top w:w="80" w:type="dxa"/>
+              <w:start w:w="120" w:type="dxa"/>
+              <w:bottom w:w="80" w:type="dxa"/>
+              <w:end w:w="120" w:type="dxa"/>
+            </w:tcMar>
+            <w:vAlign w:val="center"/>
+            <w:shd w:fill="EEF7F0"/>
+            <w:tcBorders>
+              <w:top w:val="single" w:sz="8" w:space="0" w:color="4F8A5B"/>
+              <w:start w:val="single" w:sz="8" w:space="0" w:color="4F8A5B"/>
+              <w:bottom w:val="single" w:sz="8" w:space="0" w:color="4F8A5B"/>
+              <w:end w:val="single" w:sz="8" w:space="0" w:color="4F8A5B"/>
+              <w:insideH w:val="single" w:sz="8" w:space="0" w:color="4F8A5B"/>
+              <w:insideV w:val="single" w:sz="8" w:space="0" w:color="4F8A5B"/>
+            </w:tcBorders>
+          </w:tcPr>
+          <w:p>
+            <w:pPr>
+              <w:spacing w:before="40" w:after="40"/>
+            </w:pPr>
+            <w:r>
+              <w:rPr>
+                <w:rFonts w:ascii="Calibri" w:hAnsi="Calibri"/>
+                <w:b/>
+                <w:color w:val="0B2545"/>
+                <w:sz w:val="21"/>
+              </w:rPr>
+              <w:t xml:space="preserve">Expected: </w:t>
+            </w:r>
+            <w:r>
+              <w:rPr>
+                <w:rFonts w:ascii="Calibri" w:hAnsi="Calibri"/>
+                <w:color w:val="344054"/>
+                <w:sz w:val="21"/>
+              </w:rPr>
+              <w:t>The page opens normally. If the customer uses MidPage or another MCP service, add its connector URL and required token or headers, then select Connect. MCP connectors and their credentials remain per-user.</w:t>
+            </w:r>
+          </w:p>
+        </w:tc>
+      </w:tr>
+    </w:tbl>
+    <w:p>
+      <w:pPr>
+        <w:spacing w:after="0"/>
+      </w:pPr>
+    </w:p>
+    <w:tbl>
+      <w:tblPr>
+        <w:tblW w:type="dxa" w:w="9026"/>
+        <w:jc w:val="left"/>
+        <w:tblLayout w:type="fixed"/>
+        <w:tblLook w:firstColumn="1" w:firstRow="1" w:lastColumn="0" w:lastRow="0" w:noHBand="0" w:noVBand="1" w:val="04A0"/>
+        <w:tblInd w:w="120" w:type="dxa"/>
+      </w:tblPr>
+      <w:tblGrid>
+        <w:gridCol w:w="9026"/>
+      </w:tblGrid>
+      <w:tr>
+        <w:trPr>
+          <w:cantSplit/>
+        </w:trPr>
+        <w:tc>
+          <w:tcPr>
+            <w:tcW w:type="dxa" w:w="9026"/>
+            <w:tcMar>
+              <w:top w:w="80" w:type="dxa"/>
+              <w:start w:w="120" w:type="dxa"/>
+              <w:bottom w:w="80" w:type="dxa"/>
+              <w:end w:w="120" w:type="dxa"/>
+            </w:tcMar>
+            <w:vAlign w:val="center"/>
+            <w:shd w:fill="F3F7FA"/>
+            <w:tcBorders>
+              <w:top w:val="dashed" w:sz="8" w:space="0" w:color="9FBAD0"/>
+              <w:start w:val="dashed" w:sz="8" w:space="0" w:color="9FBAD0"/>
+              <w:bottom w:val="dashed" w:sz="8" w:space="0" w:color="9FBAD0"/>
+              <w:end w:val="dashed" w:sz="8" w:space="0" w:color="9FBAD0"/>
+              <w:insideH w:val="dashed" w:sz="8" w:space="0" w:color="9FBAD0"/>
+              <w:insideV w:val="dashed" w:sz="8" w:space="0" w:color="9FBAD0"/>
+            </w:tcBorders>
+          </w:tcPr>
+          <w:p>
+            <w:pPr>
+              <w:pStyle w:val="ScreenshotPlaceholder"/>
+              <w:jc w:val="center"/>
+            </w:pPr>
+            <w:r>
+              <w:rPr>
+                <w:rFonts w:ascii="Calibri" w:hAnsi="Calibri"/>
+                <w:b/>
+                <w:color w:val="2E74B5"/>
+                <w:sz w:val="21"/>
+              </w:rPr>
+              <w:t>SCREENSHOT PLACEHOLDER 15</w:t>
+            </w:r>
+            <w:r>
+              <w:br/>
+            </w:r>
+            <w:r>
+              <w:rPr>
+                <w:rFonts w:ascii="Calibri" w:hAnsi="Calibri"/>
+                <w:color w:val="0B2545"/>
+                <w:sz w:val="20"/>
+              </w:rPr>
+              <w:t>Capture: Settings &gt; Connectors open successfully, with the customer's MCP connector configured if required</w:t>
+            </w:r>
+            <w:r>
+              <w:br/>
+            </w:r>
+            <w:r>
+              <w:rPr>
+                <w:rFonts w:ascii="Calibri" w:hAnsi="Calibri"/>
+                <w:i/>
+                <w:color w:val="667085"/>
+                <w:sz w:val="17"/>
+              </w:rPr>
+              <w:t>Redact: connector tokens, custom header values, customer URLs, email addresses, and confidential connector names.</w:t>
+            </w:r>
+            <w:r>
+              <w:br/>
+            </w:r>
+            <w:r>
+              <w:rPr>
+                <w:rFonts w:ascii="Calibri" w:hAnsi="Calibri"/>
+                <w:color w:val="667085"/>
+                <w:sz w:val="17"/>
+              </w:rPr>
+              <w:t>Replace this box during the mike.altien.com rehearsal.</w:t>
+            </w:r>
+          </w:p>
+        </w:tc>
+      </w:tr>
+    </w:tbl>
+    <w:p>
+      <w:pPr>
+        <w:spacing w:after="0"/>
+      </w:pPr>
+    </w:p>
+    <w:p>
+      <w:pPr>
+        <w:pStyle w:val="Heading2"/>
+      </w:pPr>
+      <w:r>
+        <w:t>Step 14 - Record and verify the /install recovery administrator</w:t>
+      </w:r>
+    </w:p>
+    <w:p>
+      <w:r>
+        <w:t>Fresh 1.0.11 deployments remember the first tenant-validated Microsoft user who signs in to /install. An upgrade from 1.0.9 or 1.0.10 cannot infer that historical user, so the intended recovery administrator must run the commands below once before customer handoff. Stay signed in to Azure CLI as that administrator; the commands discover the Key Vault and record the signed-in user's immutable Entra object ID and user principal name.</w:t>
+      </w:r>
+    </w:p>
+    <w:tbl>
+      <w:tblPr>
+        <w:tblW w:type="dxa" w:w="9026"/>
+        <w:jc w:val="left"/>
+        <w:tblLayout w:type="fixed"/>
+        <w:tblLook w:firstColumn="1" w:firstRow="1" w:lastColumn="0" w:lastRow="0" w:noHBand="0" w:noVBand="1" w:val="04A0"/>
+        <w:tblInd w:w="120" w:type="dxa"/>
+      </w:tblPr>
+      <w:tblGrid>
+        <w:gridCol w:w="9026"/>
+      </w:tblGrid>
+      <w:tr>
+        <w:trPr>
+          <w:cantSplit/>
+        </w:trPr>
+        <w:tc>
+          <w:tcPr>
+            <w:tcW w:type="dxa" w:w="9026"/>
+            <w:tcMar>
+              <w:top w:w="80" w:type="dxa"/>
+              <w:start w:w="120" w:type="dxa"/>
+              <w:bottom w:w="80" w:type="dxa"/>
+              <w:end w:w="120" w:type="dxa"/>
+            </w:tcMar>
+            <w:vAlign w:val="center"/>
+            <w:shd w:fill="F2F4F7"/>
+            <w:tcBorders>
+              <w:top w:val="single" w:sz="6" w:space="0" w:color="D0D5DD"/>
+              <w:start w:val="single" w:sz="6" w:space="0" w:color="D0D5DD"/>
+              <w:bottom w:val="single" w:sz="6" w:space="0" w:color="D0D5DD"/>
+              <w:end w:val="single" w:sz="6" w:space="0" w:color="D0D5DD"/>
+              <w:insideH w:val="single" w:sz="6" w:space="0" w:color="D0D5DD"/>
+              <w:insideV w:val="single" w:sz="6" w:space="0" w:color="D0D5DD"/>
+            </w:tcBorders>
+          </w:tcPr>
+          <w:p>
+            <w:pPr>
+              <w:spacing w:before="60" w:after="60" w:line="240" w:lineRule="auto"/>
+            </w:pPr>
+            <w:r>
+              <w:rPr>
+                <w:rFonts w:ascii="Consolas" w:hAnsi="Consolas"/>
+                <w:color w:val="101828"/>
+                <w:sz w:val="18"/>
+              </w:rPr>
+              <w:t>$ResourceGroup = "&lt;MIKE-RESOURCE-GROUP&gt;"</w:t>
+            </w:r>
+            <w:r>
+              <w:br/>
+            </w:r>
+            <w:r>
+              <w:rPr>
+                <w:rFonts w:ascii="Consolas" w:hAnsi="Consolas"/>
+                <w:color w:val="101828"/>
+                <w:sz w:val="18"/>
+              </w:rPr>
+              <w:t>$KeyVault = az keyvault list --resource-group $ResourceGroup `</w:t>
+            </w:r>
+            <w:r>
+              <w:br/>
+            </w:r>
+            <w:r>
+              <w:rPr>
+                <w:rFonts w:ascii="Consolas" w:hAnsi="Consolas"/>
+                <w:color w:val="101828"/>
+                <w:sz w:val="18"/>
+              </w:rPr>
+              <w:t xml:space="preserve">  --query "[0].name" -o tsv</w:t>
+            </w:r>
+            <w:r>
+              <w:br/>
+            </w:r>
+            <w:r>
+              <w:rPr>
+                <w:rFonts w:ascii="Consolas" w:hAnsi="Consolas"/>
+                <w:color w:val="101828"/>
+                <w:sz w:val="18"/>
+              </w:rPr>
+            </w:r>
+            <w:r>
+              <w:br/>
+            </w:r>
+            <w:r>
+              <w:rPr>
+                <w:rFonts w:ascii="Consolas" w:hAnsi="Consolas"/>
+                <w:color w:val="101828"/>
+                <w:sz w:val="18"/>
+              </w:rPr>
+              <w:t>$InitialAdminOid = az ad signed-in-user show --query id -o tsv</w:t>
+            </w:r>
+            <w:r>
+              <w:br/>
+            </w:r>
+            <w:r>
+              <w:rPr>
+                <w:rFonts w:ascii="Consolas" w:hAnsi="Consolas"/>
+                <w:color w:val="101828"/>
+                <w:sz w:val="18"/>
+              </w:rPr>
+              <w:t>$InitialAdminEmail = az ad signed-in-user show `</w:t>
+            </w:r>
+            <w:r>
+              <w:br/>
+            </w:r>
+            <w:r>
+              <w:rPr>
+                <w:rFonts w:ascii="Consolas" w:hAnsi="Consolas"/>
+                <w:color w:val="101828"/>
+                <w:sz w:val="18"/>
+              </w:rPr>
+              <w:t xml:space="preserve">  --query userPrincipalName -o tsv</w:t>
+            </w:r>
+            <w:r>
+              <w:br/>
+            </w:r>
+            <w:r>
+              <w:rPr>
+                <w:rFonts w:ascii="Consolas" w:hAnsi="Consolas"/>
+                <w:color w:val="101828"/>
+                <w:sz w:val="18"/>
+              </w:rPr>
+            </w:r>
+            <w:r>
+              <w:br/>
+            </w:r>
+            <w:r>
+              <w:rPr>
+                <w:rFonts w:ascii="Consolas" w:hAnsi="Consolas"/>
+                <w:color w:val="101828"/>
+                <w:sz w:val="18"/>
+              </w:rPr>
+              <w:t>az keyvault secret set --vault-name $KeyVault `</w:t>
+            </w:r>
+            <w:r>
+              <w:br/>
+            </w:r>
+            <w:r>
+              <w:rPr>
+                <w:rFonts w:ascii="Consolas" w:hAnsi="Consolas"/>
+                <w:color w:val="101828"/>
+                <w:sz w:val="18"/>
+              </w:rPr>
+              <w:t xml:space="preserve">  --name install-initial-admin-oid --value $InitialAdminOid</w:t>
+            </w:r>
+            <w:r>
+              <w:br/>
+            </w:r>
+            <w:r>
+              <w:rPr>
+                <w:rFonts w:ascii="Consolas" w:hAnsi="Consolas"/>
+                <w:color w:val="101828"/>
+                <w:sz w:val="18"/>
+              </w:rPr>
+            </w:r>
+            <w:r>
+              <w:br/>
+            </w:r>
+            <w:r>
+              <w:rPr>
+                <w:rFonts w:ascii="Consolas" w:hAnsi="Consolas"/>
+                <w:color w:val="101828"/>
+                <w:sz w:val="18"/>
+              </w:rPr>
+              <w:t>az keyvault secret set --vault-name $KeyVault `</w:t>
+            </w:r>
+            <w:r>
+              <w:br/>
+            </w:r>
+            <w:r>
+              <w:rPr>
+                <w:rFonts w:ascii="Consolas" w:hAnsi="Consolas"/>
+                <w:color w:val="101828"/>
+                <w:sz w:val="18"/>
+              </w:rPr>
+              <w:t xml:space="preserve">  --name install-initial-admin-email --value $InitialAdminEmail</w:t>
+            </w:r>
+          </w:p>
+        </w:tc>
+      </w:tr>
+    </w:tbl>
+    <w:p>
+      <w:pPr>
+        <w:spacing w:after="0"/>
+      </w:pPr>
+    </w:p>
+    <w:p>
+      <w:r>
+        <w:t>Sign out of /install, sign in again with Microsoft as that administrator, and confirm the configurator opens. This immutable object-ID recovery path continues to work if an administrator later selects the wrong group or an expected group is omitted from the sign-in token.</w:t>
+      </w:r>
+    </w:p>
+    <w:tbl>
+      <w:tblPr>
+        <w:tblW w:type="dxa" w:w="9026"/>
+        <w:jc w:val="left"/>
+        <w:tblLayout w:type="fixed"/>
+        <w:tblLook w:firstColumn="1" w:firstRow="1" w:lastColumn="0" w:lastRow="0" w:noHBand="0" w:noVBand="1" w:val="04A0"/>
+        <w:tblInd w:w="120" w:type="dxa"/>
+      </w:tblPr>
+      <w:tblGrid>
+        <w:gridCol w:w="9026"/>
+      </w:tblGrid>
+      <w:tr>
+        <w:trPr>
+          <w:cantSplit/>
+        </w:trPr>
+        <w:tc>
+          <w:tcPr>
+            <w:tcW w:type="dxa" w:w="9026"/>
+            <w:tcMar>
+              <w:top w:w="80" w:type="dxa"/>
+              <w:start w:w="120" w:type="dxa"/>
+              <w:bottom w:w="80" w:type="dxa"/>
+              <w:end w:w="120" w:type="dxa"/>
+            </w:tcMar>
+            <w:vAlign w:val="center"/>
+            <w:shd w:fill="F3F7FA"/>
+            <w:tcBorders>
+              <w:top w:val="dashed" w:sz="8" w:space="0" w:color="9FBAD0"/>
+              <w:start w:val="dashed" w:sz="8" w:space="0" w:color="9FBAD0"/>
+              <w:bottom w:val="dashed" w:sz="8" w:space="0" w:color="9FBAD0"/>
+              <w:end w:val="dashed" w:sz="8" w:space="0" w:color="9FBAD0"/>
+              <w:insideH w:val="dashed" w:sz="8" w:space="0" w:color="9FBAD0"/>
+              <w:insideV w:val="dashed" w:sz="8" w:space="0" w:color="9FBAD0"/>
+            </w:tcBorders>
+          </w:tcPr>
+          <w:p>
+            <w:pPr>
+              <w:pStyle w:val="ScreenshotPlaceholder"/>
+              <w:jc w:val="center"/>
+            </w:pPr>
+            <w:r>
+              <w:rPr>
+                <w:rFonts w:ascii="Calibri" w:hAnsi="Calibri"/>
+                <w:b/>
+                <w:color w:val="2E74B5"/>
+                <w:sz w:val="21"/>
+              </w:rPr>
+              <w:t>SCREENSHOT PLACEHOLDER 16</w:t>
+            </w:r>
+            <w:r>
+              <w:br/>
+            </w:r>
+            <w:r>
+              <w:rPr>
+                <w:rFonts w:ascii="Calibri" w:hAnsi="Calibri"/>
+                <w:color w:val="0B2545"/>
+                <w:sz w:val="20"/>
+              </w:rPr>
+              <w:t>Capture: the intended administrator signed in to /install with the configurator visible</w:t>
+            </w:r>
+            <w:r>
+              <w:br/>
+            </w:r>
+            <w:r>
+              <w:rPr>
+                <w:rFonts w:ascii="Calibri" w:hAnsi="Calibri"/>
+                <w:i/>
+                <w:color w:val="667085"/>
+                <w:sz w:val="17"/>
+              </w:rPr>
+              <w:t>Redact: email addresses, object IDs, tenant identifiers, secret values, and customer-specific resource names.</w:t>
+            </w:r>
+            <w:r>
+              <w:br/>
+            </w:r>
+            <w:r>
+              <w:rPr>
+                <w:rFonts w:ascii="Calibri" w:hAnsi="Calibri"/>
+                <w:color w:val="667085"/>
+                <w:sz w:val="17"/>
+              </w:rPr>
+              <w:t>Replace this box during the mike.altien.com rehearsal.</w:t>
+            </w:r>
+          </w:p>
+        </w:tc>
+      </w:tr>
+    </w:tbl>
+    <w:p>
+      <w:pPr>
+        <w:spacing w:after="0"/>
+      </w:pPr>
+    </w:p>
     <w:p>
       <w:pPr>
         <w:pStyle w:val="Heading1"/>
@@ -4209,7 +4925,7 @@
                 <w:color w:val="2E74B5"/>
                 <w:sz w:val="21"/>
               </w:rPr>
-              <w:t>SCREENSHOT PLACEHOLDER 15</w:t>
+              <w:t>SCREENSHOT PLACEHOLDER 17</w:t>
             </w:r>
             <w:r>
               <w:br/>

</xml_diff>

<commit_message>
docs: finalize 1.0.11 upgrade guide
</commit_message>
<xml_diff>
--- a/docs/Upgrading MikeOssAzure to 1.0.11.docx
+++ b/docs/Upgrading MikeOssAzure to 1.0.11.docx
@@ -1342,7 +1342,7 @@
                 <w:color w:val="344054"/>
                 <w:sz w:val="18"/>
               </w:rPr>
-              <w:t>Check health and telemetry; restore the previous image if verification fails.</w:t>
+              <w:t>Check health and telemetry; restore the previous backend and migration-job images if verification fails.</w:t>
             </w:r>
           </w:p>
         </w:tc>
@@ -1407,7 +1407,7 @@
                 <w:color w:val="344054"/>
                 <w:sz w:val="21"/>
               </w:rPr>
-              <w:t>Database migrations complete before the backend image changes. If migration fails, the backend is not promoted. If immediate health or telemetry verification fails, the script restores the previous backend image.</w:t>
+              <w:t>Database migrations complete before the backend image changes. If migration fails, the backend is not promoted. If the upgrade fails after changing an image, the script restores the previous backend and migration-job images. The additive, backward-compatible database migrations and telemetry resources remain in place.</w:t>
             </w:r>
           </w:p>
         </w:tc>
@@ -2093,6 +2093,10 @@
       </w:r>
     </w:p>
     <w:p>
+      <w:pPr>
+        <w:keepNext/>
+        <w:spacing w:after="60"/>
+      </w:pPr>
       <w:r>
         <w:rPr>
           <w:rFonts w:ascii="Calibri" w:hAnsi="Calibri"/>
@@ -2100,16 +2104,64 @@
           <w:color w:val="0B2545"/>
           <w:sz w:val="22"/>
         </w:rPr>
-        <w:t xml:space="preserve">Expected SHA-256: </w:t>
+        <w:t>Expected SHA-256</w:t>
       </w:r>
-      <w:r>
-        <w:rPr>
-          <w:rFonts w:ascii="Calibri" w:hAnsi="Calibri"/>
-          <w:color w:val="344054"/>
-          <w:sz w:val="22"/>
-        </w:rPr>
-        <w:t>C1AB2792DF0386EC30F0C96902F9C6CC3B6FECBF9487FF44BAAD0438AD18FAB5</w:t>
-      </w:r>
+    </w:p>
+    <w:tbl>
+      <w:tblPr>
+        <w:tblW w:type="dxa" w:w="9026"/>
+        <w:jc w:val="left"/>
+        <w:tblLayout w:type="fixed"/>
+        <w:tblLook w:firstColumn="1" w:firstRow="1" w:lastColumn="0" w:lastRow="0" w:noHBand="0" w:noVBand="1" w:val="04A0"/>
+        <w:tblInd w:w="120" w:type="dxa"/>
+      </w:tblPr>
+      <w:tblGrid>
+        <w:gridCol w:w="9026"/>
+      </w:tblGrid>
+      <w:tr>
+        <w:trPr>
+          <w:cantSplit/>
+        </w:trPr>
+        <w:tc>
+          <w:tcPr>
+            <w:tcW w:type="dxa" w:w="9026"/>
+            <w:tcMar>
+              <w:top w:w="80" w:type="dxa"/>
+              <w:start w:w="120" w:type="dxa"/>
+              <w:bottom w:w="80" w:type="dxa"/>
+              <w:end w:w="120" w:type="dxa"/>
+            </w:tcMar>
+            <w:vAlign w:val="center"/>
+            <w:shd w:fill="F2F4F7"/>
+            <w:tcBorders>
+              <w:top w:val="single" w:sz="6" w:space="0" w:color="D0D5DD"/>
+              <w:start w:val="single" w:sz="6" w:space="0" w:color="D0D5DD"/>
+              <w:bottom w:val="single" w:sz="6" w:space="0" w:color="D0D5DD"/>
+              <w:end w:val="single" w:sz="6" w:space="0" w:color="D0D5DD"/>
+              <w:insideH w:val="single" w:sz="6" w:space="0" w:color="D0D5DD"/>
+              <w:insideV w:val="single" w:sz="6" w:space="0" w:color="D0D5DD"/>
+            </w:tcBorders>
+          </w:tcPr>
+          <w:p>
+            <w:pPr>
+              <w:spacing w:before="60" w:after="60" w:line="240" w:lineRule="auto"/>
+            </w:pPr>
+            <w:r>
+              <w:rPr>
+                <w:rFonts w:ascii="Consolas" w:hAnsi="Consolas"/>
+                <w:color w:val="101828"/>
+                <w:sz w:val="18"/>
+              </w:rPr>
+              <w:t>34E913C9ACEAAF5BD3E4EC22A0E3B0B43EC762B4FC0C1A8842AD34575602F580</w:t>
+            </w:r>
+          </w:p>
+        </w:tc>
+      </w:tr>
+    </w:tbl>
+    <w:p>
+      <w:pPr>
+        <w:spacing w:after="0"/>
+      </w:pPr>
     </w:p>
     <w:tbl>
       <w:tblPr>
@@ -4386,7 +4438,7 @@
         <w:pStyle w:val="Heading2"/>
       </w:pPr>
       <w:r>
-        <w:t>Step 14 - Record and verify the /install recovery administrator</w:t>
+        <w:t>Step 14 - Set the /install recovery administrator</w:t>
       </w:r>
     </w:p>
     <w:p>
@@ -4994,7 +5046,7 @@
           <w:color w:val="344054"/>
           <w:sz w:val="22"/>
         </w:rPr>
-        <w:t>The backend remains on its starting image. Do not promote it manually.</w:t>
+        <w:t>The backend remains on its starting image and the script restores the migration-job image. Do not promote either image manually.</w:t>
       </w:r>
     </w:p>
     <w:p>
@@ -5013,7 +5065,7 @@
           <w:color w:val="344054"/>
           <w:sz w:val="22"/>
         </w:rPr>
-        <w:t>The script attempts to restore the previous backend image automatically.</w:t>
+        <w:t>The script attempts to restore the previous backend and migration-job images automatically. Database migrations and additive telemetry resources remain in place; the released migrations are backward-compatible with 1.0.9 and 1.0.10. A full database rollback would use Azure PostgreSQL point-in-time restore.</w:t>
       </w:r>
     </w:p>
     <w:p>

</xml_diff>